<commit_message>
final edits to flawed M code for first API JSON data source
</commit_message>
<xml_diff>
--- a/docs/02_Data_Setup_and_Semantic_Model_Guide.docx
+++ b/docs/02_Data_Setup_and_Semantic_Model_Guide.docx
@@ -2376,7 +2376,7 @@
                 <w:bCs/>
                 <w:noProof/>
               </w:rPr>
-              <w:t>6.5 Referential coverage check</w:t>
+              <w:t>6.5 Label coverage check</w:t>
             </w:r>
             <w:r>
               <w:rPr>
@@ -10792,7 +10792,7 @@
           <w:sz w:val="21"/>
           <w:szCs w:val="21"/>
         </w:rPr>
-        <w:t>Census revises the published category set periodically, and NAICS vintage changes alter what a code means. Run §3.4 once after obtaining your key and reconcile what comes back against this table.</w:t>
+        <w:t xml:space="preserve">Census revises the published category set periodically, and NAICS vintage changes alter what a code means. Checked against the live API on 22 September 2026: the advance survey published 21 codes, and three of the nineteen below were not among them — 4453 beer, wine and liquor stores; 452311 warehouse clubs and supercenters; 4541 electronic shopping and mail-order houses. They are published in the full Monthly Retail Trade Survey (timeseries/eits/mrts), a separate endpoint that lags the advance estimate. Any measure resting on those three — 4453 above all, named below as the national comparator for Tier 3 — needs a second query against that endpoint or a different design.</w:t>
       </w:r>
     </w:p>
     <w:p>
@@ -22323,7 +22323,7 @@
                 <w:sz w:val="19"/>
                 <w:szCs w:val="19"/>
               </w:rPr>
-              <w:t>Maps Census codes to display names and to a Discretionary / Staples / Services grouping. IsAggregate flags 44X72 and 44000 so aggregates are excluded from share denominators. Seed from Table 3.1 — all nineteen codes.</w:t>
+              <w:t>Maps Census codes to display names and to a Discretionary / Staples / Services grouping. IsAggregate flags totals and “excluding” aggregates so they are left out of share denominators. Seed it from the codes the API actually returns — 21 on 22 September 2026, not the nineteen in Table 3.1 — and add rows as Census revises the set. The table supplies labels, not the list of codes the model accepts.</w:t>
             </w:r>
           </w:p>
         </w:tc>
@@ -22501,16 +22501,15 @@
           <w:left w:val="single" w:sz="12" w:space="6" w:color="A6A6A6"/>
         </w:pBdr>
         <w:shd w:val="clear" w:color="auto" w:fill="F2F2F2"/>
-        <w:spacing w:before="120"/>
-        <w:ind w:left="180"/>
-      </w:pPr>
-      <w:r>
-        <w:rPr>
-          <w:rFonts w:ascii="Consolas" w:eastAsia="Consolas" w:hAnsi="Consolas" w:cs="Consolas"/>
-          <w:sz w:val="16"/>
-          <w:szCs w:val="16"/>
-        </w:rPr>
-        <w:t>let</w:t>
+        <w:ind w:left="180"/>
+      </w:pPr>
+      <w:r>
+        <w:rPr>
+          <w:rFonts w:ascii="Consolas" w:eastAsia="Consolas" w:hAnsi="Consolas" w:cs="Consolas"/>
+          <w:sz w:val="16"/>
+          <w:szCs w:val="16"/>
+        </w:rPr>
+        <w:t xml:space="preserve">let</w:t>
       </w:r>
     </w:p>
     <w:p>
@@ -22697,7 +22696,6 @@
           <w:sz w:val="16"/>
           <w:szCs w:val="16"/>
         </w:rPr>
-        <w:lastRenderedPageBreak/>
         <w:t xml:space="preserve">                       {"CategoryCode",  type text},</w:t>
       </w:r>
     </w:p>
@@ -22936,41 +22934,959 @@
           <w:sz w:val="16"/>
           <w:szCs w:val="16"/>
         </w:rPr>
-        <w:t xml:space="preserve">    NoBlanks = Table.SelectRows(</w:t>
-      </w:r>
-    </w:p>
-    <w:p>
-      <w:pPr>
-        <w:pBdr>
-          <w:left w:val="single" w:sz="12" w:space="6" w:color="A6A6A6"/>
-        </w:pBdr>
-        <w:shd w:val="clear" w:color="auto" w:fill="F2F2F2"/>
-        <w:ind w:left="180"/>
-      </w:pPr>
-      <w:r>
-        <w:rPr>
-          <w:rFonts w:ascii="Consolas" w:eastAsia="Consolas" w:hAnsi="Consolas" w:cs="Consolas"/>
-          <w:sz w:val="16"/>
-          <w:szCs w:val="16"/>
-        </w:rPr>
-        <w:t xml:space="preserve">                   Trimmed,</w:t>
-      </w:r>
-    </w:p>
-    <w:p>
-      <w:pPr>
-        <w:pBdr>
-          <w:left w:val="single" w:sz="12" w:space="6" w:color="A6A6A6"/>
-        </w:pBdr>
-        <w:shd w:val="clear" w:color="auto" w:fill="F2F2F2"/>
-        <w:ind w:left="180"/>
-      </w:pPr>
-      <w:r>
-        <w:rPr>
-          <w:rFonts w:ascii="Consolas" w:eastAsia="Consolas" w:hAnsi="Consolas" w:cs="Consolas"/>
-          <w:sz w:val="16"/>
-          <w:szCs w:val="16"/>
-        </w:rPr>
-        <w:t xml:space="preserve">                   each [CategoryCode] &lt;&gt; null and [CategoryCode] &lt;&gt; ""</w:t>
+        <w:t xml:space="preserve">    // Every code the API returned, mapped or not. The workbook supplies the</w:t>
+      </w:r>
+    </w:p>
+    <w:p>
+      <w:pPr>
+        <w:pBdr>
+          <w:left w:val="single" w:sz="12" w:space="6" w:color="A6A6A6"/>
+        </w:pBdr>
+        <w:shd w:val="clear" w:color="auto" w:fill="F2F2F2"/>
+        <w:ind w:left="180"/>
+      </w:pPr>
+      <w:r>
+        <w:rPr>
+          <w:rFonts w:ascii="Consolas" w:eastAsia="Consolas" w:hAnsi="Consolas" w:cs="Consolas"/>
+          <w:sz w:val="16"/>
+          <w:szCs w:val="16"/>
+        </w:rPr>
+        <w:t xml:space="preserve">    // labels; it does not decide which codes exist. A code with no row still</w:t>
+      </w:r>
+    </w:p>
+    <w:p>
+      <w:pPr>
+        <w:pBdr>
+          <w:left w:val="single" w:sz="12" w:space="6" w:color="A6A6A6"/>
+        </w:pBdr>
+        <w:shd w:val="clear" w:color="auto" w:fill="F2F2F2"/>
+        <w:ind w:left="180"/>
+      </w:pPr>
+      <w:r>
+        <w:rPr>
+          <w:rFonts w:ascii="Consolas" w:eastAsia="Consolas" w:hAnsi="Consolas" w:cs="Consolas"/>
+          <w:sz w:val="16"/>
+          <w:szCs w:val="16"/>
+        </w:rPr>
+        <w:t xml:space="preserve">    // gets a dimension member, so a Census revision can never produce a blank.</w:t>
+      </w:r>
+    </w:p>
+    <w:p>
+      <w:pPr>
+        <w:pBdr>
+          <w:left w:val="single" w:sz="12" w:space="6" w:color="A6A6A6"/>
+        </w:pBdr>
+        <w:shd w:val="clear" w:color="auto" w:fill="F2F2F2"/>
+        <w:ind w:left="180"/>
+      </w:pPr>
+      <w:r>
+        <w:rPr>
+          <w:rFonts w:ascii="Consolas" w:eastAsia="Consolas" w:hAnsi="Consolas" w:cs="Consolas"/>
+          <w:sz w:val="16"/>
+          <w:szCs w:val="16"/>
+        </w:rPr>
+        <w:t xml:space="preserve">    ApiCodes = Table.Distinct(Table.SelectColumns(FactSectorSales, {"category_code"})),</w:t>
+      </w:r>
+    </w:p>
+    <w:p>
+      <w:pPr>
+        <w:pBdr>
+          <w:left w:val="single" w:sz="12" w:space="6" w:color="A6A6A6"/>
+        </w:pBdr>
+        <w:shd w:val="clear" w:color="auto" w:fill="F2F2F2"/>
+        <w:ind w:left="180"/>
+      </w:pPr>
+      <w:r>
+        <w:rPr>
+          <w:rFonts w:ascii="Consolas" w:eastAsia="Consolas" w:hAnsi="Consolas" w:cs="Consolas"/>
+          <w:sz w:val="16"/>
+          <w:szCs w:val="16"/>
+        </w:rPr>
+        <w:t xml:space="preserve"> </w:t>
+      </w:r>
+    </w:p>
+    <w:p>
+      <w:pPr>
+        <w:pBdr>
+          <w:left w:val="single" w:sz="12" w:space="6" w:color="A6A6A6"/>
+        </w:pBdr>
+        <w:shd w:val="clear" w:color="auto" w:fill="F2F2F2"/>
+        <w:ind w:left="180"/>
+      </w:pPr>
+      <w:r>
+        <w:rPr>
+          <w:rFonts w:ascii="Consolas" w:eastAsia="Consolas" w:hAnsi="Consolas" w:cs="Consolas"/>
+          <w:sz w:val="16"/>
+          <w:szCs w:val="16"/>
+        </w:rPr>
+        <w:t xml:space="preserve">    Joined   = Table.NestedJoin(ApiCodes, {"category_code"}, Trimmed, {"CategoryCode"},</w:t>
+      </w:r>
+    </w:p>
+    <w:p>
+      <w:pPr>
+        <w:pBdr>
+          <w:left w:val="single" w:sz="12" w:space="6" w:color="A6A6A6"/>
+        </w:pBdr>
+        <w:shd w:val="clear" w:color="auto" w:fill="F2F2F2"/>
+        <w:ind w:left="180"/>
+      </w:pPr>
+      <w:r>
+        <w:rPr>
+          <w:rFonts w:ascii="Consolas" w:eastAsia="Consolas" w:hAnsi="Consolas" w:cs="Consolas"/>
+          <w:sz w:val="16"/>
+          <w:szCs w:val="16"/>
+        </w:rPr>
+        <w:t xml:space="preserve">                                "m", JoinKind.LeftOuter),</w:t>
+      </w:r>
+    </w:p>
+    <w:p>
+      <w:pPr>
+        <w:pBdr>
+          <w:left w:val="single" w:sz="12" w:space="6" w:color="A6A6A6"/>
+        </w:pBdr>
+        <w:shd w:val="clear" w:color="auto" w:fill="F2F2F2"/>
+        <w:ind w:left="180"/>
+      </w:pPr>
+      <w:r>
+        <w:rPr>
+          <w:rFonts w:ascii="Consolas" w:eastAsia="Consolas" w:hAnsi="Consolas" w:cs="Consolas"/>
+          <w:sz w:val="16"/>
+          <w:szCs w:val="16"/>
+        </w:rPr>
+        <w:t xml:space="preserve"> </w:t>
+      </w:r>
+    </w:p>
+    <w:p>
+      <w:pPr>
+        <w:pBdr>
+          <w:left w:val="single" w:sz="12" w:space="6" w:color="A6A6A6"/>
+        </w:pBdr>
+        <w:shd w:val="clear" w:color="auto" w:fill="F2F2F2"/>
+        <w:ind w:left="180"/>
+      </w:pPr>
+      <w:r>
+        <w:rPr>
+          <w:rFonts w:ascii="Consolas" w:eastAsia="Consolas" w:hAnsi="Consolas" w:cs="Consolas"/>
+          <w:sz w:val="16"/>
+          <w:szCs w:val="16"/>
+        </w:rPr>
+        <w:t xml:space="preserve">    Expanded = Table.ExpandTableColumn(</w:t>
+      </w:r>
+    </w:p>
+    <w:p>
+      <w:pPr>
+        <w:pBdr>
+          <w:left w:val="single" w:sz="12" w:space="6" w:color="A6A6A6"/>
+        </w:pBdr>
+        <w:shd w:val="clear" w:color="auto" w:fill="F2F2F2"/>
+        <w:ind w:left="180"/>
+      </w:pPr>
+      <w:r>
+        <w:rPr>
+          <w:rFonts w:ascii="Consolas" w:eastAsia="Consolas" w:hAnsi="Consolas" w:cs="Consolas"/>
+          <w:sz w:val="16"/>
+          <w:szCs w:val="16"/>
+        </w:rPr>
+        <w:t xml:space="preserve">                   Joined, "m",</w:t>
+      </w:r>
+    </w:p>
+    <w:p>
+      <w:pPr>
+        <w:pBdr>
+          <w:left w:val="single" w:sz="12" w:space="6" w:color="A6A6A6"/>
+        </w:pBdr>
+        <w:shd w:val="clear" w:color="auto" w:fill="F2F2F2"/>
+        <w:ind w:left="180"/>
+      </w:pPr>
+      <w:r>
+        <w:rPr>
+          <w:rFonts w:ascii="Consolas" w:eastAsia="Consolas" w:hAnsi="Consolas" w:cs="Consolas"/>
+          <w:sz w:val="16"/>
+          <w:szCs w:val="16"/>
+        </w:rPr>
+        <w:t xml:space="preserve">                   {"CategoryName", "CategoryGroup", "DisplayOrder", "IsAggregate"}</w:t>
+      </w:r>
+    </w:p>
+    <w:p>
+      <w:pPr>
+        <w:pBdr>
+          <w:left w:val="single" w:sz="12" w:space="6" w:color="A6A6A6"/>
+        </w:pBdr>
+        <w:shd w:val="clear" w:color="auto" w:fill="F2F2F2"/>
+        <w:ind w:left="180"/>
+      </w:pPr>
+      <w:r>
+        <w:rPr>
+          <w:rFonts w:ascii="Consolas" w:eastAsia="Consolas" w:hAnsi="Consolas" w:cs="Consolas"/>
+          <w:sz w:val="16"/>
+          <w:szCs w:val="16"/>
+        </w:rPr>
+        <w:t xml:space="preserve">               ),</w:t>
+      </w:r>
+    </w:p>
+    <w:p>
+      <w:pPr>
+        <w:pBdr>
+          <w:left w:val="single" w:sz="12" w:space="6" w:color="A6A6A6"/>
+        </w:pBdr>
+        <w:shd w:val="clear" w:color="auto" w:fill="F2F2F2"/>
+        <w:ind w:left="180"/>
+      </w:pPr>
+      <w:r>
+        <w:rPr>
+          <w:rFonts w:ascii="Consolas" w:eastAsia="Consolas" w:hAnsi="Consolas" w:cs="Consolas"/>
+          <w:sz w:val="16"/>
+          <w:szCs w:val="16"/>
+        </w:rPr>
+        <w:t xml:space="preserve"> </w:t>
+      </w:r>
+    </w:p>
+    <w:p>
+      <w:pPr>
+        <w:pBdr>
+          <w:left w:val="single" w:sz="12" w:space="6" w:color="A6A6A6"/>
+        </w:pBdr>
+        <w:shd w:val="clear" w:color="auto" w:fill="F2F2F2"/>
+        <w:ind w:left="180"/>
+      </w:pPr>
+      <w:r>
+        <w:rPr>
+          <w:rFonts w:ascii="Consolas" w:eastAsia="Consolas" w:hAnsi="Consolas" w:cs="Consolas"/>
+          <w:sz w:val="16"/>
+          <w:szCs w:val="16"/>
+        </w:rPr>
+        <w:t xml:space="preserve">    Named    = Table.ReplaceValue(</w:t>
+      </w:r>
+    </w:p>
+    <w:p>
+      <w:pPr>
+        <w:pBdr>
+          <w:left w:val="single" w:sz="12" w:space="6" w:color="A6A6A6"/>
+        </w:pBdr>
+        <w:shd w:val="clear" w:color="auto" w:fill="F2F2F2"/>
+        <w:ind w:left="180"/>
+      </w:pPr>
+      <w:r>
+        <w:rPr>
+          <w:rFonts w:ascii="Consolas" w:eastAsia="Consolas" w:hAnsi="Consolas" w:cs="Consolas"/>
+          <w:sz w:val="16"/>
+          <w:szCs w:val="16"/>
+        </w:rPr>
+        <w:t xml:space="preserve">                   Expanded,</w:t>
+      </w:r>
+    </w:p>
+    <w:p>
+      <w:pPr>
+        <w:pBdr>
+          <w:left w:val="single" w:sz="12" w:space="6" w:color="A6A6A6"/>
+        </w:pBdr>
+        <w:shd w:val="clear" w:color="auto" w:fill="F2F2F2"/>
+        <w:ind w:left="180"/>
+      </w:pPr>
+      <w:r>
+        <w:rPr>
+          <w:rFonts w:ascii="Consolas" w:eastAsia="Consolas" w:hAnsi="Consolas" w:cs="Consolas"/>
+          <w:sz w:val="16"/>
+          <w:szCs w:val="16"/>
+        </w:rPr>
+        <w:t xml:space="preserve">                   each [CategoryName],</w:t>
+      </w:r>
+    </w:p>
+    <w:p>
+      <w:pPr>
+        <w:pBdr>
+          <w:left w:val="single" w:sz="12" w:space="6" w:color="A6A6A6"/>
+        </w:pBdr>
+        <w:shd w:val="clear" w:color="auto" w:fill="F2F2F2"/>
+        <w:ind w:left="180"/>
+      </w:pPr>
+      <w:r>
+        <w:rPr>
+          <w:rFonts w:ascii="Consolas" w:eastAsia="Consolas" w:hAnsi="Consolas" w:cs="Consolas"/>
+          <w:sz w:val="16"/>
+          <w:szCs w:val="16"/>
+        </w:rPr>
+        <w:t xml:space="preserve">                   each if [CategoryName] = null or [CategoryName] = ""</w:t>
+      </w:r>
+    </w:p>
+    <w:p>
+      <w:pPr>
+        <w:pBdr>
+          <w:left w:val="single" w:sz="12" w:space="6" w:color="A6A6A6"/>
+        </w:pBdr>
+        <w:shd w:val="clear" w:color="auto" w:fill="F2F2F2"/>
+        <w:ind w:left="180"/>
+      </w:pPr>
+      <w:r>
+        <w:rPr>
+          <w:rFonts w:ascii="Consolas" w:eastAsia="Consolas" w:hAnsi="Consolas" w:cs="Consolas"/>
+          <w:sz w:val="16"/>
+          <w:szCs w:val="16"/>
+        </w:rPr>
+        <w:t xml:space="preserve">                        then "(" &amp; [category_code] &amp; ") unmapped"</w:t>
+      </w:r>
+    </w:p>
+    <w:p>
+      <w:pPr>
+        <w:pBdr>
+          <w:left w:val="single" w:sz="12" w:space="6" w:color="A6A6A6"/>
+        </w:pBdr>
+        <w:shd w:val="clear" w:color="auto" w:fill="F2F2F2"/>
+        <w:ind w:left="180"/>
+      </w:pPr>
+      <w:r>
+        <w:rPr>
+          <w:rFonts w:ascii="Consolas" w:eastAsia="Consolas" w:hAnsi="Consolas" w:cs="Consolas"/>
+          <w:sz w:val="16"/>
+          <w:szCs w:val="16"/>
+        </w:rPr>
+        <w:t xml:space="preserve">                        else [CategoryName],</w:t>
+      </w:r>
+    </w:p>
+    <w:p>
+      <w:pPr>
+        <w:pBdr>
+          <w:left w:val="single" w:sz="12" w:space="6" w:color="A6A6A6"/>
+        </w:pBdr>
+        <w:shd w:val="clear" w:color="auto" w:fill="F2F2F2"/>
+        <w:ind w:left="180"/>
+      </w:pPr>
+      <w:r>
+        <w:rPr>
+          <w:rFonts w:ascii="Consolas" w:eastAsia="Consolas" w:hAnsi="Consolas" w:cs="Consolas"/>
+          <w:sz w:val="16"/>
+          <w:szCs w:val="16"/>
+        </w:rPr>
+        <w:t xml:space="preserve">                   Replacer.ReplaceValue, {"CategoryName"}</w:t>
+      </w:r>
+    </w:p>
+    <w:p>
+      <w:pPr>
+        <w:pBdr>
+          <w:left w:val="single" w:sz="12" w:space="6" w:color="A6A6A6"/>
+        </w:pBdr>
+        <w:shd w:val="clear" w:color="auto" w:fill="F2F2F2"/>
+        <w:ind w:left="180"/>
+      </w:pPr>
+      <w:r>
+        <w:rPr>
+          <w:rFonts w:ascii="Consolas" w:eastAsia="Consolas" w:hAnsi="Consolas" w:cs="Consolas"/>
+          <w:sz w:val="16"/>
+          <w:szCs w:val="16"/>
+        </w:rPr>
+        <w:t xml:space="preserve">               ),</w:t>
+      </w:r>
+    </w:p>
+    <w:p>
+      <w:pPr>
+        <w:pBdr>
+          <w:left w:val="single" w:sz="12" w:space="6" w:color="A6A6A6"/>
+        </w:pBdr>
+        <w:shd w:val="clear" w:color="auto" w:fill="F2F2F2"/>
+        <w:ind w:left="180"/>
+      </w:pPr>
+      <w:r>
+        <w:rPr>
+          <w:rFonts w:ascii="Consolas" w:eastAsia="Consolas" w:hAnsi="Consolas" w:cs="Consolas"/>
+          <w:sz w:val="16"/>
+          <w:szCs w:val="16"/>
+        </w:rPr>
+        <w:t xml:space="preserve"> </w:t>
+      </w:r>
+    </w:p>
+    <w:p>
+      <w:pPr>
+        <w:pBdr>
+          <w:left w:val="single" w:sz="12" w:space="6" w:color="A6A6A6"/>
+        </w:pBdr>
+        <w:shd w:val="clear" w:color="auto" w:fill="F2F2F2"/>
+        <w:ind w:left="180"/>
+      </w:pPr>
+      <w:r>
+        <w:rPr>
+          <w:rFonts w:ascii="Consolas" w:eastAsia="Consolas" w:hAnsi="Consolas" w:cs="Consolas"/>
+          <w:sz w:val="16"/>
+          <w:szCs w:val="16"/>
+        </w:rPr>
+        <w:t xml:space="preserve">    Grouped  = Table.ReplaceValue(</w:t>
+      </w:r>
+    </w:p>
+    <w:p>
+      <w:pPr>
+        <w:pBdr>
+          <w:left w:val="single" w:sz="12" w:space="6" w:color="A6A6A6"/>
+        </w:pBdr>
+        <w:shd w:val="clear" w:color="auto" w:fill="F2F2F2"/>
+        <w:ind w:left="180"/>
+      </w:pPr>
+      <w:r>
+        <w:rPr>
+          <w:rFonts w:ascii="Consolas" w:eastAsia="Consolas" w:hAnsi="Consolas" w:cs="Consolas"/>
+          <w:sz w:val="16"/>
+          <w:szCs w:val="16"/>
+        </w:rPr>
+        <w:t xml:space="preserve">                   Named,</w:t>
+      </w:r>
+    </w:p>
+    <w:p>
+      <w:pPr>
+        <w:pBdr>
+          <w:left w:val="single" w:sz="12" w:space="6" w:color="A6A6A6"/>
+        </w:pBdr>
+        <w:shd w:val="clear" w:color="auto" w:fill="F2F2F2"/>
+        <w:ind w:left="180"/>
+      </w:pPr>
+      <w:r>
+        <w:rPr>
+          <w:rFonts w:ascii="Consolas" w:eastAsia="Consolas" w:hAnsi="Consolas" w:cs="Consolas"/>
+          <w:sz w:val="16"/>
+          <w:szCs w:val="16"/>
+        </w:rPr>
+        <w:t xml:space="preserve">                   each [CategoryGroup],</w:t>
+      </w:r>
+    </w:p>
+    <w:p>
+      <w:pPr>
+        <w:pBdr>
+          <w:left w:val="single" w:sz="12" w:space="6" w:color="A6A6A6"/>
+        </w:pBdr>
+        <w:shd w:val="clear" w:color="auto" w:fill="F2F2F2"/>
+        <w:ind w:left="180"/>
+      </w:pPr>
+      <w:r>
+        <w:rPr>
+          <w:rFonts w:ascii="Consolas" w:eastAsia="Consolas" w:hAnsi="Consolas" w:cs="Consolas"/>
+          <w:sz w:val="16"/>
+          <w:szCs w:val="16"/>
+        </w:rPr>
+        <w:t xml:space="preserve">                   each if [CategoryGroup] = null or [CategoryGroup] = ""</w:t>
+      </w:r>
+    </w:p>
+    <w:p>
+      <w:pPr>
+        <w:pBdr>
+          <w:left w:val="single" w:sz="12" w:space="6" w:color="A6A6A6"/>
+        </w:pBdr>
+        <w:shd w:val="clear" w:color="auto" w:fill="F2F2F2"/>
+        <w:ind w:left="180"/>
+      </w:pPr>
+      <w:r>
+        <w:rPr>
+          <w:rFonts w:ascii="Consolas" w:eastAsia="Consolas" w:hAnsi="Consolas" w:cs="Consolas"/>
+          <w:sz w:val="16"/>
+          <w:szCs w:val="16"/>
+        </w:rPr>
+        <w:t xml:space="preserve">                        then "Unclassified"</w:t>
+      </w:r>
+    </w:p>
+    <w:p>
+      <w:pPr>
+        <w:pBdr>
+          <w:left w:val="single" w:sz="12" w:space="6" w:color="A6A6A6"/>
+        </w:pBdr>
+        <w:shd w:val="clear" w:color="auto" w:fill="F2F2F2"/>
+        <w:ind w:left="180"/>
+      </w:pPr>
+      <w:r>
+        <w:rPr>
+          <w:rFonts w:ascii="Consolas" w:eastAsia="Consolas" w:hAnsi="Consolas" w:cs="Consolas"/>
+          <w:sz w:val="16"/>
+          <w:szCs w:val="16"/>
+        </w:rPr>
+        <w:t xml:space="preserve">                        else [CategoryGroup],</w:t>
+      </w:r>
+    </w:p>
+    <w:p>
+      <w:pPr>
+        <w:pBdr>
+          <w:left w:val="single" w:sz="12" w:space="6" w:color="A6A6A6"/>
+        </w:pBdr>
+        <w:shd w:val="clear" w:color="auto" w:fill="F2F2F2"/>
+        <w:ind w:left="180"/>
+      </w:pPr>
+      <w:r>
+        <w:rPr>
+          <w:rFonts w:ascii="Consolas" w:eastAsia="Consolas" w:hAnsi="Consolas" w:cs="Consolas"/>
+          <w:sz w:val="16"/>
+          <w:szCs w:val="16"/>
+        </w:rPr>
+        <w:t xml:space="preserve">                   Replacer.ReplaceValue, {"CategoryGroup"}</w:t>
+      </w:r>
+    </w:p>
+    <w:p>
+      <w:pPr>
+        <w:pBdr>
+          <w:left w:val="single" w:sz="12" w:space="6" w:color="A6A6A6"/>
+        </w:pBdr>
+        <w:shd w:val="clear" w:color="auto" w:fill="F2F2F2"/>
+        <w:ind w:left="180"/>
+      </w:pPr>
+      <w:r>
+        <w:rPr>
+          <w:rFonts w:ascii="Consolas" w:eastAsia="Consolas" w:hAnsi="Consolas" w:cs="Consolas"/>
+          <w:sz w:val="16"/>
+          <w:szCs w:val="16"/>
+        </w:rPr>
+        <w:t xml:space="preserve">               ),</w:t>
+      </w:r>
+    </w:p>
+    <w:p>
+      <w:pPr>
+        <w:pBdr>
+          <w:left w:val="single" w:sz="12" w:space="6" w:color="A6A6A6"/>
+        </w:pBdr>
+        <w:shd w:val="clear" w:color="auto" w:fill="F2F2F2"/>
+        <w:ind w:left="180"/>
+      </w:pPr>
+      <w:r>
+        <w:rPr>
+          <w:rFonts w:ascii="Consolas" w:eastAsia="Consolas" w:hAnsi="Consolas" w:cs="Consolas"/>
+          <w:sz w:val="16"/>
+          <w:szCs w:val="16"/>
+        </w:rPr>
+        <w:t xml:space="preserve"> </w:t>
+      </w:r>
+    </w:p>
+    <w:p>
+      <w:pPr>
+        <w:pBdr>
+          <w:left w:val="single" w:sz="12" w:space="6" w:color="A6A6A6"/>
+        </w:pBdr>
+        <w:shd w:val="clear" w:color="auto" w:fill="F2F2F2"/>
+        <w:ind w:left="180"/>
+      </w:pPr>
+      <w:r>
+        <w:rPr>
+          <w:rFonts w:ascii="Consolas" w:eastAsia="Consolas" w:hAnsi="Consolas" w:cs="Consolas"/>
+          <w:sz w:val="16"/>
+          <w:szCs w:val="16"/>
+        </w:rPr>
+        <w:t xml:space="preserve">    Ordered  = Table.ReplaceValue(</w:t>
+      </w:r>
+    </w:p>
+    <w:p>
+      <w:pPr>
+        <w:pBdr>
+          <w:left w:val="single" w:sz="12" w:space="6" w:color="A6A6A6"/>
+        </w:pBdr>
+        <w:shd w:val="clear" w:color="auto" w:fill="F2F2F2"/>
+        <w:ind w:left="180"/>
+      </w:pPr>
+      <w:r>
+        <w:rPr>
+          <w:rFonts w:ascii="Consolas" w:eastAsia="Consolas" w:hAnsi="Consolas" w:cs="Consolas"/>
+          <w:sz w:val="16"/>
+          <w:szCs w:val="16"/>
+        </w:rPr>
+        <w:t xml:space="preserve">                   Grouped,</w:t>
+      </w:r>
+    </w:p>
+    <w:p>
+      <w:pPr>
+        <w:pBdr>
+          <w:left w:val="single" w:sz="12" w:space="6" w:color="A6A6A6"/>
+        </w:pBdr>
+        <w:shd w:val="clear" w:color="auto" w:fill="F2F2F2"/>
+        <w:ind w:left="180"/>
+      </w:pPr>
+      <w:r>
+        <w:rPr>
+          <w:rFonts w:ascii="Consolas" w:eastAsia="Consolas" w:hAnsi="Consolas" w:cs="Consolas"/>
+          <w:sz w:val="16"/>
+          <w:szCs w:val="16"/>
+        </w:rPr>
+        <w:t xml:space="preserve">                   each [DisplayOrder],</w:t>
+      </w:r>
+    </w:p>
+    <w:p>
+      <w:pPr>
+        <w:pBdr>
+          <w:left w:val="single" w:sz="12" w:space="6" w:color="A6A6A6"/>
+        </w:pBdr>
+        <w:shd w:val="clear" w:color="auto" w:fill="F2F2F2"/>
+        <w:ind w:left="180"/>
+      </w:pPr>
+      <w:r>
+        <w:rPr>
+          <w:rFonts w:ascii="Consolas" w:eastAsia="Consolas" w:hAnsi="Consolas" w:cs="Consolas"/>
+          <w:sz w:val="16"/>
+          <w:szCs w:val="16"/>
+        </w:rPr>
+        <w:t xml:space="preserve">                   each if [DisplayOrder] = null then 9000 else [DisplayOrder],</w:t>
+      </w:r>
+    </w:p>
+    <w:p>
+      <w:pPr>
+        <w:pBdr>
+          <w:left w:val="single" w:sz="12" w:space="6" w:color="A6A6A6"/>
+        </w:pBdr>
+        <w:shd w:val="clear" w:color="auto" w:fill="F2F2F2"/>
+        <w:ind w:left="180"/>
+      </w:pPr>
+      <w:r>
+        <w:rPr>
+          <w:rFonts w:ascii="Consolas" w:eastAsia="Consolas" w:hAnsi="Consolas" w:cs="Consolas"/>
+          <w:sz w:val="16"/>
+          <w:szCs w:val="16"/>
+        </w:rPr>
+        <w:t xml:space="preserve">                   Replacer.ReplaceValue, {"DisplayOrder"}</w:t>
+      </w:r>
+    </w:p>
+    <w:p>
+      <w:pPr>
+        <w:pBdr>
+          <w:left w:val="single" w:sz="12" w:space="6" w:color="A6A6A6"/>
+        </w:pBdr>
+        <w:shd w:val="clear" w:color="auto" w:fill="F2F2F2"/>
+        <w:ind w:left="180"/>
+      </w:pPr>
+      <w:r>
+        <w:rPr>
+          <w:rFonts w:ascii="Consolas" w:eastAsia="Consolas" w:hAnsi="Consolas" w:cs="Consolas"/>
+          <w:sz w:val="16"/>
+          <w:szCs w:val="16"/>
+        </w:rPr>
+        <w:t xml:space="preserve">               ),</w:t>
+      </w:r>
+    </w:p>
+    <w:p>
+      <w:pPr>
+        <w:pBdr>
+          <w:left w:val="single" w:sz="12" w:space="6" w:color="A6A6A6"/>
+        </w:pBdr>
+        <w:shd w:val="clear" w:color="auto" w:fill="F2F2F2"/>
+        <w:ind w:left="180"/>
+      </w:pPr>
+      <w:r>
+        <w:rPr>
+          <w:rFonts w:ascii="Consolas" w:eastAsia="Consolas" w:hAnsi="Consolas" w:cs="Consolas"/>
+          <w:sz w:val="16"/>
+          <w:szCs w:val="16"/>
+        </w:rPr>
+        <w:t xml:space="preserve"> </w:t>
+      </w:r>
+    </w:p>
+    <w:p>
+      <w:pPr>
+        <w:pBdr>
+          <w:left w:val="single" w:sz="12" w:space="6" w:color="A6A6A6"/>
+        </w:pBdr>
+        <w:shd w:val="clear" w:color="auto" w:fill="F2F2F2"/>
+        <w:ind w:left="180"/>
+      </w:pPr>
+      <w:r>
+        <w:rPr>
+          <w:rFonts w:ascii="Consolas" w:eastAsia="Consolas" w:hAnsi="Consolas" w:cs="Consolas"/>
+          <w:sz w:val="16"/>
+          <w:szCs w:val="16"/>
+        </w:rPr>
+        <w:t xml:space="preserve">    // An unlabelled code containing a letter is a Census "excluding" aggregate</w:t>
+      </w:r>
+    </w:p>
+    <w:p>
+      <w:pPr>
+        <w:pBdr>
+          <w:left w:val="single" w:sz="12" w:space="6" w:color="A6A6A6"/>
+        </w:pBdr>
+        <w:shd w:val="clear" w:color="auto" w:fill="F2F2F2"/>
+        <w:ind w:left="180"/>
+      </w:pPr>
+      <w:r>
+        <w:rPr>
+          <w:rFonts w:ascii="Consolas" w:eastAsia="Consolas" w:hAnsi="Consolas" w:cs="Consolas"/>
+          <w:sz w:val="16"/>
+          <w:szCs w:val="16"/>
+        </w:rPr>
+        <w:t xml:space="preserve">    // - 44W72, 44Y72, 44Z72 - and must stay out of share denominators until</w:t>
+      </w:r>
+    </w:p>
+    <w:p>
+      <w:pPr>
+        <w:pBdr>
+          <w:left w:val="single" w:sz="12" w:space="6" w:color="A6A6A6"/>
+        </w:pBdr>
+        <w:shd w:val="clear" w:color="auto" w:fill="F2F2F2"/>
+        <w:ind w:left="180"/>
+      </w:pPr>
+      <w:r>
+        <w:rPr>
+          <w:rFonts w:ascii="Consolas" w:eastAsia="Consolas" w:hAnsi="Consolas" w:cs="Consolas"/>
+          <w:sz w:val="16"/>
+          <w:szCs w:val="16"/>
+        </w:rPr>
+        <w:t xml:space="preserve">    // someone says otherwise.</w:t>
+      </w:r>
+    </w:p>
+    <w:p>
+      <w:pPr>
+        <w:pBdr>
+          <w:left w:val="single" w:sz="12" w:space="6" w:color="A6A6A6"/>
+        </w:pBdr>
+        <w:shd w:val="clear" w:color="auto" w:fill="F2F2F2"/>
+        <w:ind w:left="180"/>
+      </w:pPr>
+      <w:r>
+        <w:rPr>
+          <w:rFonts w:ascii="Consolas" w:eastAsia="Consolas" w:hAnsi="Consolas" w:cs="Consolas"/>
+          <w:sz w:val="16"/>
+          <w:szCs w:val="16"/>
+        </w:rPr>
+        <w:t xml:space="preserve">    Flagged  = Table.ReplaceValue(</w:t>
+      </w:r>
+    </w:p>
+    <w:p>
+      <w:pPr>
+        <w:pBdr>
+          <w:left w:val="single" w:sz="12" w:space="6" w:color="A6A6A6"/>
+        </w:pBdr>
+        <w:shd w:val="clear" w:color="auto" w:fill="F2F2F2"/>
+        <w:ind w:left="180"/>
+      </w:pPr>
+      <w:r>
+        <w:rPr>
+          <w:rFonts w:ascii="Consolas" w:eastAsia="Consolas" w:hAnsi="Consolas" w:cs="Consolas"/>
+          <w:sz w:val="16"/>
+          <w:szCs w:val="16"/>
+        </w:rPr>
+        <w:t xml:space="preserve">                   Ordered,</w:t>
+      </w:r>
+    </w:p>
+    <w:p>
+      <w:pPr>
+        <w:pBdr>
+          <w:left w:val="single" w:sz="12" w:space="6" w:color="A6A6A6"/>
+        </w:pBdr>
+        <w:shd w:val="clear" w:color="auto" w:fill="F2F2F2"/>
+        <w:ind w:left="180"/>
+      </w:pPr>
+      <w:r>
+        <w:rPr>
+          <w:rFonts w:ascii="Consolas" w:eastAsia="Consolas" w:hAnsi="Consolas" w:cs="Consolas"/>
+          <w:sz w:val="16"/>
+          <w:szCs w:val="16"/>
+        </w:rPr>
+        <w:t xml:space="preserve">                   each [IsAggregate],</w:t>
+      </w:r>
+    </w:p>
+    <w:p>
+      <w:pPr>
+        <w:pBdr>
+          <w:left w:val="single" w:sz="12" w:space="6" w:color="A6A6A6"/>
+        </w:pBdr>
+        <w:shd w:val="clear" w:color="auto" w:fill="F2F2F2"/>
+        <w:ind w:left="180"/>
+      </w:pPr>
+      <w:r>
+        <w:rPr>
+          <w:rFonts w:ascii="Consolas" w:eastAsia="Consolas" w:hAnsi="Consolas" w:cs="Consolas"/>
+          <w:sz w:val="16"/>
+          <w:szCs w:val="16"/>
+        </w:rPr>
+        <w:t xml:space="preserve">                   each if [IsAggregate] &lt;&gt; null</w:t>
+      </w:r>
+    </w:p>
+    <w:p>
+      <w:pPr>
+        <w:pBdr>
+          <w:left w:val="single" w:sz="12" w:space="6" w:color="A6A6A6"/>
+        </w:pBdr>
+        <w:shd w:val="clear" w:color="auto" w:fill="F2F2F2"/>
+        <w:ind w:left="180"/>
+      </w:pPr>
+      <w:r>
+        <w:rPr>
+          <w:rFonts w:ascii="Consolas" w:eastAsia="Consolas" w:hAnsi="Consolas" w:cs="Consolas"/>
+          <w:sz w:val="16"/>
+          <w:szCs w:val="16"/>
+        </w:rPr>
+        <w:t xml:space="preserve">                        then [IsAggregate]</w:t>
+      </w:r>
+    </w:p>
+    <w:p>
+      <w:pPr>
+        <w:pBdr>
+          <w:left w:val="single" w:sz="12" w:space="6" w:color="A6A6A6"/>
+        </w:pBdr>
+        <w:shd w:val="clear" w:color="auto" w:fill="F2F2F2"/>
+        <w:ind w:left="180"/>
+      </w:pPr>
+      <w:r>
+        <w:rPr>
+          <w:rFonts w:ascii="Consolas" w:eastAsia="Consolas" w:hAnsi="Consolas" w:cs="Consolas"/>
+          <w:sz w:val="16"/>
+          <w:szCs w:val="16"/>
+        </w:rPr>
+        <w:t xml:space="preserve">                        else List.Count(List.Select(</w:t>
+      </w:r>
+    </w:p>
+    <w:p>
+      <w:pPr>
+        <w:pBdr>
+          <w:left w:val="single" w:sz="12" w:space="6" w:color="A6A6A6"/>
+        </w:pBdr>
+        <w:shd w:val="clear" w:color="auto" w:fill="F2F2F2"/>
+        <w:ind w:left="180"/>
+      </w:pPr>
+      <w:r>
+        <w:rPr>
+          <w:rFonts w:ascii="Consolas" w:eastAsia="Consolas" w:hAnsi="Consolas" w:cs="Consolas"/>
+          <w:sz w:val="16"/>
+          <w:szCs w:val="16"/>
+        </w:rPr>
+        <w:t xml:space="preserve">                                 Text.ToList([category_code]),</w:t>
+      </w:r>
+    </w:p>
+    <w:p>
+      <w:pPr>
+        <w:pBdr>
+          <w:left w:val="single" w:sz="12" w:space="6" w:color="A6A6A6"/>
+        </w:pBdr>
+        <w:shd w:val="clear" w:color="auto" w:fill="F2F2F2"/>
+        <w:ind w:left="180"/>
+      </w:pPr>
+      <w:r>
+        <w:rPr>
+          <w:rFonts w:ascii="Consolas" w:eastAsia="Consolas" w:hAnsi="Consolas" w:cs="Consolas"/>
+          <w:sz w:val="16"/>
+          <w:szCs w:val="16"/>
+        </w:rPr>
+        <w:t xml:space="preserve">                                 each not Value.Is(Value.FromText(_), type number))) &gt; 0,</w:t>
+      </w:r>
+    </w:p>
+    <w:p>
+      <w:pPr>
+        <w:pBdr>
+          <w:left w:val="single" w:sz="12" w:space="6" w:color="A6A6A6"/>
+        </w:pBdr>
+        <w:shd w:val="clear" w:color="auto" w:fill="F2F2F2"/>
+        <w:ind w:left="180"/>
+      </w:pPr>
+      <w:r>
+        <w:rPr>
+          <w:rFonts w:ascii="Consolas" w:eastAsia="Consolas" w:hAnsi="Consolas" w:cs="Consolas"/>
+          <w:sz w:val="16"/>
+          <w:szCs w:val="16"/>
+        </w:rPr>
+        <w:t xml:space="preserve">                   Replacer.ReplaceValue, {"IsAggregate"}</w:t>
+      </w:r>
+    </w:p>
+    <w:p>
+      <w:pPr>
+        <w:pBdr>
+          <w:left w:val="single" w:sz="12" w:space="6" w:color="A6A6A6"/>
+        </w:pBdr>
+        <w:shd w:val="clear" w:color="auto" w:fill="F2F2F2"/>
+        <w:ind w:left="180"/>
+      </w:pPr>
+      <w:r>
+        <w:rPr>
+          <w:rFonts w:ascii="Consolas" w:eastAsia="Consolas" w:hAnsi="Consolas" w:cs="Consolas"/>
+          <w:sz w:val="16"/>
+          <w:szCs w:val="16"/>
+        </w:rPr>
+        <w:t xml:space="preserve">               ),</w:t>
+      </w:r>
+    </w:p>
+    <w:p>
+      <w:pPr>
+        <w:pBdr>
+          <w:left w:val="single" w:sz="12" w:space="6" w:color="A6A6A6"/>
+        </w:pBdr>
+        <w:shd w:val="clear" w:color="auto" w:fill="F2F2F2"/>
+        <w:ind w:left="180"/>
+      </w:pPr>
+      <w:r>
+        <w:rPr>
+          <w:rFonts w:ascii="Consolas" w:eastAsia="Consolas" w:hAnsi="Consolas" w:cs="Consolas"/>
+          <w:sz w:val="16"/>
+          <w:szCs w:val="16"/>
+        </w:rPr>
+        <w:t xml:space="preserve"> </w:t>
+      </w:r>
+    </w:p>
+    <w:p>
+      <w:pPr>
+        <w:pBdr>
+          <w:left w:val="single" w:sz="12" w:space="6" w:color="A6A6A6"/>
+        </w:pBdr>
+        <w:shd w:val="clear" w:color="auto" w:fill="F2F2F2"/>
+        <w:ind w:left="180"/>
+      </w:pPr>
+      <w:r>
+        <w:rPr>
+          <w:rFonts w:ascii="Consolas" w:eastAsia="Consolas" w:hAnsi="Consolas" w:cs="Consolas"/>
+          <w:sz w:val="16"/>
+          <w:szCs w:val="16"/>
+        </w:rPr>
+        <w:t xml:space="preserve">    Renamed  = Table.RenameColumns(Flagged, {{"category_code", "CategoryCode"}}),</w:t>
+      </w:r>
+    </w:p>
+    <w:p>
+      <w:pPr>
+        <w:pBdr>
+          <w:left w:val="single" w:sz="12" w:space="6" w:color="A6A6A6"/>
+        </w:pBdr>
+        <w:shd w:val="clear" w:color="auto" w:fill="F2F2F2"/>
+        <w:ind w:left="180"/>
+      </w:pPr>
+      <w:r>
+        <w:rPr>
+          <w:rFonts w:ascii="Consolas" w:eastAsia="Consolas" w:hAnsi="Consolas" w:cs="Consolas"/>
+          <w:sz w:val="16"/>
+          <w:szCs w:val="16"/>
+        </w:rPr>
+        <w:t xml:space="preserve"> </w:t>
+      </w:r>
+    </w:p>
+    <w:p>
+      <w:pPr>
+        <w:pBdr>
+          <w:left w:val="single" w:sz="12" w:space="6" w:color="A6A6A6"/>
+        </w:pBdr>
+        <w:shd w:val="clear" w:color="auto" w:fill="F2F2F2"/>
+        <w:ind w:left="180"/>
+      </w:pPr>
+      <w:r>
+        <w:rPr>
+          <w:rFonts w:ascii="Consolas" w:eastAsia="Consolas" w:hAnsi="Consolas" w:cs="Consolas"/>
+          <w:sz w:val="16"/>
+          <w:szCs w:val="16"/>
+        </w:rPr>
+        <w:t xml:space="preserve">    Final    = Table.SelectColumns(</w:t>
+      </w:r>
+    </w:p>
+    <w:p>
+      <w:pPr>
+        <w:pBdr>
+          <w:left w:val="single" w:sz="12" w:space="6" w:color="A6A6A6"/>
+        </w:pBdr>
+        <w:shd w:val="clear" w:color="auto" w:fill="F2F2F2"/>
+        <w:ind w:left="180"/>
+      </w:pPr>
+      <w:r>
+        <w:rPr>
+          <w:rFonts w:ascii="Consolas" w:eastAsia="Consolas" w:hAnsi="Consolas" w:cs="Consolas"/>
+          <w:sz w:val="16"/>
+          <w:szCs w:val="16"/>
+        </w:rPr>
+        <w:t xml:space="preserve">                   Renamed,</w:t>
+      </w:r>
+    </w:p>
+    <w:p>
+      <w:pPr>
+        <w:pBdr>
+          <w:left w:val="single" w:sz="12" w:space="6" w:color="A6A6A6"/>
+        </w:pBdr>
+        <w:shd w:val="clear" w:color="auto" w:fill="F2F2F2"/>
+        <w:ind w:left="180"/>
+      </w:pPr>
+      <w:r>
+        <w:rPr>
+          <w:rFonts w:ascii="Consolas" w:eastAsia="Consolas" w:hAnsi="Consolas" w:cs="Consolas"/>
+          <w:sz w:val="16"/>
+          <w:szCs w:val="16"/>
+        </w:rPr>
+        <w:t xml:space="preserve">                   {"CategoryCode", "CategoryName", "CategoryGroup", "DisplayOrder", "IsAggregate"}</w:t>
       </w:r>
     </w:p>
     <w:p>
@@ -23004,25 +23920,24 @@
           <w:sz w:val="16"/>
           <w:szCs w:val="16"/>
         </w:rPr>
-        <w:t>in</w:t>
-      </w:r>
-    </w:p>
-    <w:p>
-      <w:pPr>
-        <w:pBdr>
-          <w:left w:val="single" w:sz="12" w:space="6" w:color="A6A6A6"/>
-        </w:pBdr>
-        <w:shd w:val="clear" w:color="auto" w:fill="F2F2F2"/>
-        <w:spacing w:after="160"/>
-        <w:ind w:left="180"/>
-      </w:pPr>
-      <w:r>
-        <w:rPr>
-          <w:rFonts w:ascii="Consolas" w:eastAsia="Consolas" w:hAnsi="Consolas" w:cs="Consolas"/>
-          <w:sz w:val="16"/>
-          <w:szCs w:val="16"/>
-        </w:rPr>
-        <w:t xml:space="preserve">    NoBlanks</w:t>
+        <w:t xml:space="preserve">in</w:t>
+      </w:r>
+    </w:p>
+    <w:p>
+      <w:pPr>
+        <w:pBdr>
+          <w:left w:val="single" w:sz="12" w:space="6" w:color="A6A6A6"/>
+        </w:pBdr>
+        <w:shd w:val="clear" w:color="auto" w:fill="F2F2F2"/>
+        <w:ind w:left="180"/>
+      </w:pPr>
+      <w:r>
+        <w:rPr>
+          <w:rFonts w:ascii="Consolas" w:eastAsia="Consolas" w:hAnsi="Consolas" w:cs="Consolas"/>
+          <w:sz w:val="16"/>
+          <w:szCs w:val="16"/>
+        </w:rPr>
+        <w:t xml:space="preserve">    Final</w:t>
       </w:r>
     </w:p>
     <w:p>
@@ -24262,7 +25177,7 @@
           <w:sz w:val="25"/>
           <w:szCs w:val="25"/>
         </w:rPr>
-        <w:t>6.5 Referential coverage check</w:t>
+        <w:t>6.5 Label coverage check</w:t>
       </w:r>
       <w:bookmarkEnd w:id="35"/>
     </w:p>
@@ -24271,196 +25186,296 @@
         <w:spacing w:after="120" w:line="276" w:lineRule="auto"/>
       </w:pPr>
       <w:r>
-        <w:t>Before loading, confirm every category_code the API returns exists in the workbook. If this returns any rows, add them to the workbook before proceeding — a missing mapping shows up later as a blank slicer entry that nobody can explain.</w:t>
-      </w:r>
-    </w:p>
-    <w:p>
-      <w:pPr>
-        <w:pBdr>
-          <w:left w:val="single" w:sz="12" w:space="6" w:color="A6A6A6"/>
-        </w:pBdr>
-        <w:shd w:val="clear" w:color="auto" w:fill="F2F2F2"/>
-        <w:spacing w:before="120"/>
-        <w:ind w:left="180"/>
-      </w:pPr>
-      <w:r>
-        <w:rPr>
-          <w:rFonts w:ascii="Consolas" w:eastAsia="Consolas" w:hAnsi="Consolas" w:cs="Consolas"/>
-          <w:sz w:val="16"/>
-          <w:szCs w:val="16"/>
-        </w:rPr>
-        <w:t>let</w:t>
-      </w:r>
-    </w:p>
-    <w:p>
-      <w:pPr>
-        <w:pBdr>
-          <w:left w:val="single" w:sz="12" w:space="6" w:color="A6A6A6"/>
-        </w:pBdr>
-        <w:shd w:val="clear" w:color="auto" w:fill="F2F2F2"/>
-        <w:ind w:left="180"/>
-      </w:pPr>
-      <w:r>
-        <w:rPr>
-          <w:rFonts w:ascii="Consolas" w:eastAsia="Consolas" w:hAnsi="Consolas" w:cs="Consolas"/>
-          <w:sz w:val="16"/>
-          <w:szCs w:val="16"/>
-        </w:rPr>
-        <w:t xml:space="preserve">    Api       = Table.Distinct(Table.SelectColumns(FactSectorSales, {"category_code"})),</w:t>
-      </w:r>
-    </w:p>
-    <w:p>
-      <w:pPr>
-        <w:pBdr>
-          <w:left w:val="single" w:sz="12" w:space="6" w:color="A6A6A6"/>
-        </w:pBdr>
-        <w:shd w:val="clear" w:color="auto" w:fill="F2F2F2"/>
-        <w:ind w:left="180"/>
-      </w:pPr>
-      <w:r>
-        <w:rPr>
-          <w:rFonts w:ascii="Consolas" w:eastAsia="Consolas" w:hAnsi="Consolas" w:cs="Consolas"/>
-          <w:sz w:val="16"/>
-          <w:szCs w:val="16"/>
-        </w:rPr>
-        <w:t xml:space="preserve">    Ref       = Table.SelectColumns(DimCategory, {"CategoryCode"}),</w:t>
-      </w:r>
-    </w:p>
-    <w:p>
-      <w:pPr>
-        <w:pBdr>
-          <w:left w:val="single" w:sz="12" w:space="6" w:color="A6A6A6"/>
-        </w:pBdr>
-        <w:shd w:val="clear" w:color="auto" w:fill="F2F2F2"/>
-        <w:ind w:left="180"/>
-      </w:pPr>
-      <w:r>
-        <w:rPr>
-          <w:rFonts w:ascii="Consolas" w:eastAsia="Consolas" w:hAnsi="Consolas" w:cs="Consolas"/>
-          <w:sz w:val="16"/>
-          <w:szCs w:val="16"/>
-        </w:rPr>
-        <w:t xml:space="preserve">    Joined    = Table.NestedJoin(Api, {"category_code"}, Ref, {"CategoryCode"},</w:t>
-      </w:r>
-    </w:p>
-    <w:p>
-      <w:pPr>
-        <w:pBdr>
-          <w:left w:val="single" w:sz="12" w:space="6" w:color="A6A6A6"/>
-        </w:pBdr>
-        <w:shd w:val="clear" w:color="auto" w:fill="F2F2F2"/>
-        <w:ind w:left="180"/>
-      </w:pPr>
-      <w:r>
-        <w:rPr>
-          <w:rFonts w:ascii="Consolas" w:eastAsia="Consolas" w:hAnsi="Consolas" w:cs="Consolas"/>
-          <w:sz w:val="16"/>
-          <w:szCs w:val="16"/>
-        </w:rPr>
-        <w:t xml:space="preserve">                                 "m", JoinKind.LeftOuter),</w:t>
-      </w:r>
-    </w:p>
-    <w:p>
-      <w:pPr>
-        <w:pBdr>
-          <w:left w:val="single" w:sz="12" w:space="6" w:color="A6A6A6"/>
-        </w:pBdr>
-        <w:shd w:val="clear" w:color="auto" w:fill="F2F2F2"/>
-        <w:ind w:left="180"/>
-      </w:pPr>
-      <w:r>
-        <w:rPr>
-          <w:rFonts w:ascii="Consolas" w:eastAsia="Consolas" w:hAnsi="Consolas" w:cs="Consolas"/>
-          <w:sz w:val="16"/>
-          <w:szCs w:val="16"/>
-        </w:rPr>
-        <w:t xml:space="preserve">    Unmatched = Table.SelectRows(</w:t>
-      </w:r>
-    </w:p>
-    <w:p>
-      <w:pPr>
-        <w:pBdr>
-          <w:left w:val="single" w:sz="12" w:space="6" w:color="A6A6A6"/>
-        </w:pBdr>
-        <w:shd w:val="clear" w:color="auto" w:fill="F2F2F2"/>
-        <w:ind w:left="180"/>
-      </w:pPr>
-      <w:r>
-        <w:rPr>
-          <w:rFonts w:ascii="Consolas" w:eastAsia="Consolas" w:hAnsi="Consolas" w:cs="Consolas"/>
-          <w:sz w:val="16"/>
-          <w:szCs w:val="16"/>
-        </w:rPr>
-        <w:t xml:space="preserve">                    Table.AddColumn(Joined, "n", each Table.RowCount([m]), Int64.Type),</w:t>
-      </w:r>
-    </w:p>
-    <w:p>
-      <w:pPr>
-        <w:pBdr>
-          <w:left w:val="single" w:sz="12" w:space="6" w:color="A6A6A6"/>
-        </w:pBdr>
-        <w:shd w:val="clear" w:color="auto" w:fill="F2F2F2"/>
-        <w:ind w:left="180"/>
-      </w:pPr>
-      <w:r>
-        <w:rPr>
-          <w:rFonts w:ascii="Consolas" w:eastAsia="Consolas" w:hAnsi="Consolas" w:cs="Consolas"/>
-          <w:sz w:val="16"/>
-          <w:szCs w:val="16"/>
-        </w:rPr>
-        <w:t xml:space="preserve">                    each [n] = 0</w:t>
-      </w:r>
-    </w:p>
-    <w:p>
-      <w:pPr>
-        <w:pBdr>
-          <w:left w:val="single" w:sz="12" w:space="6" w:color="A6A6A6"/>
-        </w:pBdr>
-        <w:shd w:val="clear" w:color="auto" w:fill="F2F2F2"/>
-        <w:ind w:left="180"/>
-      </w:pPr>
-      <w:r>
-        <w:rPr>
-          <w:rFonts w:ascii="Consolas" w:eastAsia="Consolas" w:hAnsi="Consolas" w:cs="Consolas"/>
-          <w:sz w:val="16"/>
-          <w:szCs w:val="16"/>
-        </w:rPr>
-        <w:t xml:space="preserve">                )</w:t>
-      </w:r>
-    </w:p>
-    <w:p>
-      <w:pPr>
-        <w:pBdr>
-          <w:left w:val="single" w:sz="12" w:space="6" w:color="A6A6A6"/>
-        </w:pBdr>
-        <w:shd w:val="clear" w:color="auto" w:fill="F2F2F2"/>
-        <w:ind w:left="180"/>
-      </w:pPr>
-      <w:r>
-        <w:rPr>
-          <w:rFonts w:ascii="Consolas" w:eastAsia="Consolas" w:hAnsi="Consolas" w:cs="Consolas"/>
-          <w:sz w:val="16"/>
-          <w:szCs w:val="16"/>
-        </w:rPr>
-        <w:t>in</w:t>
-      </w:r>
-    </w:p>
-    <w:p>
-      <w:pPr>
-        <w:pBdr>
-          <w:left w:val="single" w:sz="12" w:space="6" w:color="A6A6A6"/>
-        </w:pBdr>
-        <w:shd w:val="clear" w:color="auto" w:fill="F2F2F2"/>
-        <w:spacing w:after="160"/>
-        <w:ind w:left="180"/>
-      </w:pPr>
-      <w:r>
-        <w:rPr>
-          <w:rFonts w:ascii="Consolas" w:eastAsia="Consolas" w:hAnsi="Consolas" w:cs="Consolas"/>
-          <w:sz w:val="16"/>
-          <w:szCs w:val="16"/>
-        </w:rPr>
-        <w:t xml:space="preserve">    Table.SelectColumns(Unmatched, {"category_code"})</w:t>
+        <w:t>Every code the API returns reaches the model whether or not the workbook has a row for it: §6.2 falls back to “(code) unmapped” in the Unclassified group. This query lists the codes still carrying that fallback. Rows here are a labelling backlog rather than a blocker — nothing breaks while they sit unlabelled, but an unmapped code is visible to anyone reading a report, so clear them before publishing.</w:t>
+      </w:r>
+    </w:p>
+    <w:p>
+      <w:pPr>
+        <w:pBdr>
+          <w:left w:val="single" w:sz="12" w:space="6" w:color="A6A6A6"/>
+        </w:pBdr>
+        <w:shd w:val="clear" w:color="auto" w:fill="F2F2F2"/>
+        <w:ind w:left="180"/>
+      </w:pPr>
+      <w:r>
+        <w:rPr>
+          <w:rFonts w:ascii="Consolas" w:eastAsia="Consolas" w:hAnsi="Consolas" w:cs="Consolas"/>
+          <w:sz w:val="16"/>
+          <w:szCs w:val="16"/>
+        </w:rPr>
+        <w:t xml:space="preserve">let</w:t>
+      </w:r>
+    </w:p>
+    <w:p>
+      <w:pPr>
+        <w:pBdr>
+          <w:left w:val="single" w:sz="12" w:space="6" w:color="A6A6A6"/>
+        </w:pBdr>
+        <w:shd w:val="clear" w:color="auto" w:fill="F2F2F2"/>
+        <w:ind w:left="180"/>
+      </w:pPr>
+      <w:r>
+        <w:rPr>
+          <w:rFonts w:ascii="Consolas" w:eastAsia="Consolas" w:hAnsi="Consolas" w:cs="Consolas"/>
+          <w:sz w:val="16"/>
+          <w:szCs w:val="16"/>
+        </w:rPr>
+        <w:t xml:space="preserve">    Source     = Excel.Workbook(</w:t>
+      </w:r>
+    </w:p>
+    <w:p>
+      <w:pPr>
+        <w:pBdr>
+          <w:left w:val="single" w:sz="12" w:space="6" w:color="A6A6A6"/>
+        </w:pBdr>
+        <w:shd w:val="clear" w:color="auto" w:fill="F2F2F2"/>
+        <w:ind w:left="180"/>
+      </w:pPr>
+      <w:r>
+        <w:rPr>
+          <w:rFonts w:ascii="Consolas" w:eastAsia="Consolas" w:hAnsi="Consolas" w:cs="Consolas"/>
+          <w:sz w:val="16"/>
+          <w:szCs w:val="16"/>
+        </w:rPr>
+        <w:t xml:space="preserve">                     File.Contents(pRefMappingsPath),</w:t>
+      </w:r>
+    </w:p>
+    <w:p>
+      <w:pPr>
+        <w:pBdr>
+          <w:left w:val="single" w:sz="12" w:space="6" w:color="A6A6A6"/>
+        </w:pBdr>
+        <w:shd w:val="clear" w:color="auto" w:fill="F2F2F2"/>
+        <w:ind w:left="180"/>
+      </w:pPr>
+      <w:r>
+        <w:rPr>
+          <w:rFonts w:ascii="Consolas" w:eastAsia="Consolas" w:hAnsi="Consolas" w:cs="Consolas"/>
+          <w:sz w:val="16"/>
+          <w:szCs w:val="16"/>
+        </w:rPr>
+        <w:t xml:space="preserve">                     null, true</w:t>
+      </w:r>
+    </w:p>
+    <w:p>
+      <w:pPr>
+        <w:pBdr>
+          <w:left w:val="single" w:sz="12" w:space="6" w:color="A6A6A6"/>
+        </w:pBdr>
+        <w:shd w:val="clear" w:color="auto" w:fill="F2F2F2"/>
+        <w:ind w:left="180"/>
+      </w:pPr>
+      <w:r>
+        <w:rPr>
+          <w:rFonts w:ascii="Consolas" w:eastAsia="Consolas" w:hAnsi="Consolas" w:cs="Consolas"/>
+          <w:sz w:val="16"/>
+          <w:szCs w:val="16"/>
+        </w:rPr>
+        <w:t xml:space="preserve">                 ),</w:t>
+      </w:r>
+    </w:p>
+    <w:p>
+      <w:pPr>
+        <w:pBdr>
+          <w:left w:val="single" w:sz="12" w:space="6" w:color="A6A6A6"/>
+        </w:pBdr>
+        <w:shd w:val="clear" w:color="auto" w:fill="F2F2F2"/>
+        <w:ind w:left="180"/>
+      </w:pPr>
+      <w:r>
+        <w:rPr>
+          <w:rFonts w:ascii="Consolas" w:eastAsia="Consolas" w:hAnsi="Consolas" w:cs="Consolas"/>
+          <w:sz w:val="16"/>
+          <w:szCs w:val="16"/>
+        </w:rPr>
+        <w:t xml:space="preserve">    Ref        = Source{[Item = "tbl_CategoryMap", Kind = "Table"]}[Data],</w:t>
+      </w:r>
+    </w:p>
+    <w:p>
+      <w:pPr>
+        <w:pBdr>
+          <w:left w:val="single" w:sz="12" w:space="6" w:color="A6A6A6"/>
+        </w:pBdr>
+        <w:shd w:val="clear" w:color="auto" w:fill="F2F2F2"/>
+        <w:ind w:left="180"/>
+      </w:pPr>
+      <w:r>
+        <w:rPr>
+          <w:rFonts w:ascii="Consolas" w:eastAsia="Consolas" w:hAnsi="Consolas" w:cs="Consolas"/>
+          <w:sz w:val="16"/>
+          <w:szCs w:val="16"/>
+        </w:rPr>
+        <w:t xml:space="preserve"> </w:t>
+      </w:r>
+    </w:p>
+    <w:p>
+      <w:pPr>
+        <w:pBdr>
+          <w:left w:val="single" w:sz="12" w:space="6" w:color="A6A6A6"/>
+        </w:pBdr>
+        <w:shd w:val="clear" w:color="auto" w:fill="F2F2F2"/>
+        <w:ind w:left="180"/>
+      </w:pPr>
+      <w:r>
+        <w:rPr>
+          <w:rFonts w:ascii="Consolas" w:eastAsia="Consolas" w:hAnsi="Consolas" w:cs="Consolas"/>
+          <w:sz w:val="16"/>
+          <w:szCs w:val="16"/>
+        </w:rPr>
+        <w:t xml:space="preserve">    Api        = Table.Distinct(Table.SelectColumns(FactSectorSales, {"category_code"})),</w:t>
+      </w:r>
+    </w:p>
+    <w:p>
+      <w:pPr>
+        <w:pBdr>
+          <w:left w:val="single" w:sz="12" w:space="6" w:color="A6A6A6"/>
+        </w:pBdr>
+        <w:shd w:val="clear" w:color="auto" w:fill="F2F2F2"/>
+        <w:ind w:left="180"/>
+      </w:pPr>
+      <w:r>
+        <w:rPr>
+          <w:rFonts w:ascii="Consolas" w:eastAsia="Consolas" w:hAnsi="Consolas" w:cs="Consolas"/>
+          <w:sz w:val="16"/>
+          <w:szCs w:val="16"/>
+        </w:rPr>
+        <w:t xml:space="preserve"> </w:t>
+      </w:r>
+    </w:p>
+    <w:p>
+      <w:pPr>
+        <w:pBdr>
+          <w:left w:val="single" w:sz="12" w:space="6" w:color="A6A6A6"/>
+        </w:pBdr>
+        <w:shd w:val="clear" w:color="auto" w:fill="F2F2F2"/>
+        <w:ind w:left="180"/>
+      </w:pPr>
+      <w:r>
+        <w:rPr>
+          <w:rFonts w:ascii="Consolas" w:eastAsia="Consolas" w:hAnsi="Consolas" w:cs="Consolas"/>
+          <w:sz w:val="16"/>
+          <w:szCs w:val="16"/>
+        </w:rPr>
+        <w:t xml:space="preserve">    Joined     = Table.NestedJoin(Api, {"category_code"}, Ref, {"CategoryCode"},</w:t>
+      </w:r>
+    </w:p>
+    <w:p>
+      <w:pPr>
+        <w:pBdr>
+          <w:left w:val="single" w:sz="12" w:space="6" w:color="A6A6A6"/>
+        </w:pBdr>
+        <w:shd w:val="clear" w:color="auto" w:fill="F2F2F2"/>
+        <w:ind w:left="180"/>
+      </w:pPr>
+      <w:r>
+        <w:rPr>
+          <w:rFonts w:ascii="Consolas" w:eastAsia="Consolas" w:hAnsi="Consolas" w:cs="Consolas"/>
+          <w:sz w:val="16"/>
+          <w:szCs w:val="16"/>
+        </w:rPr>
+        <w:t xml:space="preserve">                                  "m", JoinKind.LeftOuter),</w:t>
+      </w:r>
+    </w:p>
+    <w:p>
+      <w:pPr>
+        <w:pBdr>
+          <w:left w:val="single" w:sz="12" w:space="6" w:color="A6A6A6"/>
+        </w:pBdr>
+        <w:shd w:val="clear" w:color="auto" w:fill="F2F2F2"/>
+        <w:ind w:left="180"/>
+      </w:pPr>
+      <w:r>
+        <w:rPr>
+          <w:rFonts w:ascii="Consolas" w:eastAsia="Consolas" w:hAnsi="Consolas" w:cs="Consolas"/>
+          <w:sz w:val="16"/>
+          <w:szCs w:val="16"/>
+        </w:rPr>
+        <w:t xml:space="preserve">    Unlabelled = Table.SelectRows(</w:t>
+      </w:r>
+    </w:p>
+    <w:p>
+      <w:pPr>
+        <w:pBdr>
+          <w:left w:val="single" w:sz="12" w:space="6" w:color="A6A6A6"/>
+        </w:pBdr>
+        <w:shd w:val="clear" w:color="auto" w:fill="F2F2F2"/>
+        <w:ind w:left="180"/>
+      </w:pPr>
+      <w:r>
+        <w:rPr>
+          <w:rFonts w:ascii="Consolas" w:eastAsia="Consolas" w:hAnsi="Consolas" w:cs="Consolas"/>
+          <w:sz w:val="16"/>
+          <w:szCs w:val="16"/>
+        </w:rPr>
+        <w:t xml:space="preserve">                     Table.AddColumn(Joined, "n", each Table.RowCount([m]), Int64.Type),</w:t>
+      </w:r>
+    </w:p>
+    <w:p>
+      <w:pPr>
+        <w:pBdr>
+          <w:left w:val="single" w:sz="12" w:space="6" w:color="A6A6A6"/>
+        </w:pBdr>
+        <w:shd w:val="clear" w:color="auto" w:fill="F2F2F2"/>
+        <w:ind w:left="180"/>
+      </w:pPr>
+      <w:r>
+        <w:rPr>
+          <w:rFonts w:ascii="Consolas" w:eastAsia="Consolas" w:hAnsi="Consolas" w:cs="Consolas"/>
+          <w:sz w:val="16"/>
+          <w:szCs w:val="16"/>
+        </w:rPr>
+        <w:t xml:space="preserve">                     each [n] = 0</w:t>
+      </w:r>
+    </w:p>
+    <w:p>
+      <w:pPr>
+        <w:pBdr>
+          <w:left w:val="single" w:sz="12" w:space="6" w:color="A6A6A6"/>
+        </w:pBdr>
+        <w:shd w:val="clear" w:color="auto" w:fill="F2F2F2"/>
+        <w:ind w:left="180"/>
+      </w:pPr>
+      <w:r>
+        <w:rPr>
+          <w:rFonts w:ascii="Consolas" w:eastAsia="Consolas" w:hAnsi="Consolas" w:cs="Consolas"/>
+          <w:sz w:val="16"/>
+          <w:szCs w:val="16"/>
+        </w:rPr>
+        <w:t xml:space="preserve">                 )</w:t>
+      </w:r>
+    </w:p>
+    <w:p>
+      <w:pPr>
+        <w:pBdr>
+          <w:left w:val="single" w:sz="12" w:space="6" w:color="A6A6A6"/>
+        </w:pBdr>
+        <w:shd w:val="clear" w:color="auto" w:fill="F2F2F2"/>
+        <w:ind w:left="180"/>
+      </w:pPr>
+      <w:r>
+        <w:rPr>
+          <w:rFonts w:ascii="Consolas" w:eastAsia="Consolas" w:hAnsi="Consolas" w:cs="Consolas"/>
+          <w:sz w:val="16"/>
+          <w:szCs w:val="16"/>
+        </w:rPr>
+        <w:t xml:space="preserve">in</w:t>
+      </w:r>
+    </w:p>
+    <w:p>
+      <w:pPr>
+        <w:pBdr>
+          <w:left w:val="single" w:sz="12" w:space="6" w:color="A6A6A6"/>
+        </w:pBdr>
+        <w:shd w:val="clear" w:color="auto" w:fill="F2F2F2"/>
+        <w:ind w:left="180"/>
+      </w:pPr>
+      <w:r>
+        <w:rPr>
+          <w:rFonts w:ascii="Consolas" w:eastAsia="Consolas" w:hAnsi="Consolas" w:cs="Consolas"/>
+          <w:sz w:val="16"/>
+          <w:szCs w:val="16"/>
+        </w:rPr>
+        <w:t xml:space="preserve">    Table.SelectColumns(Unlabelled, {"category_code"})</w:t>
       </w:r>
     </w:p>
     <w:p>

</xml_diff>